<commit_message>
Resources - 4/21/2026 - part 4
</commit_message>
<xml_diff>
--- a/1-Links/2-Education/8-External library link/1-GitHub - Mohammed-3tef - Computer_Science_Books.docx
+++ b/1-Links/2-Education/8-External library link/1-GitHub - Mohammed-3tef - Computer_Science_Books.docx
@@ -161,7 +161,23 @@
           <w:sz w:val="18"/>
           <w:highlight w:val="lightGray"/>
         </w:rPr>
-        <w:t>/21/2025]</w:t>
+        <w:t>/21/202</w:t>
+      </w:r>
+      <w:r>
+        <w:rPr>
+          <w:rFonts w:ascii="Arial" w:eastAsia="Arial" w:hAnsi="Arial"/>
+          <w:sz w:val="18"/>
+          <w:highlight w:val="lightGray"/>
+        </w:rPr>
+        <w:t>6</w:t>
+      </w:r>
+      <w:r>
+        <w:rPr>
+          <w:rFonts w:ascii="Arial" w:eastAsia="Arial" w:hAnsi="Arial"/>
+          <w:sz w:val="18"/>
+          <w:highlight w:val="lightGray"/>
+        </w:rPr>
+        <w:t>]</w:t>
       </w:r>
     </w:p>
     <w:p>
@@ -323,55 +339,7 @@
           <w:sz w:val="18"/>
           <w:highlight w:val="lightGray"/>
         </w:rPr>
-        <w:t>[</w:t>
-      </w:r>
-      <w:r>
-        <w:rPr>
-          <w:rFonts w:ascii="Arial" w:eastAsia="Arial" w:hAnsi="Arial"/>
-          <w:sz w:val="18"/>
-          <w:highlight w:val="lightGray"/>
-        </w:rPr>
-        <w:t>4</w:t>
-      </w:r>
-      <w:r>
-        <w:rPr>
-          <w:rFonts w:ascii="Arial" w:eastAsia="Arial" w:hAnsi="Arial"/>
-          <w:sz w:val="18"/>
-          <w:highlight w:val="lightGray"/>
-        </w:rPr>
-        <w:t>/</w:t>
-      </w:r>
-      <w:r>
-        <w:rPr>
-          <w:rFonts w:ascii="Arial" w:eastAsia="Arial" w:hAnsi="Arial"/>
-          <w:sz w:val="18"/>
-          <w:highlight w:val="lightGray"/>
-        </w:rPr>
-        <w:t>21</w:t>
-      </w:r>
-      <w:r>
-        <w:rPr>
-          <w:rFonts w:ascii="Arial" w:eastAsia="Arial" w:hAnsi="Arial"/>
-          <w:sz w:val="18"/>
-          <w:highlight w:val="lightGray"/>
-        </w:rPr>
-        <w:t>/202</w:t>
-      </w:r>
-      <w:r>
-        <w:rPr>
-          <w:rFonts w:ascii="Arial" w:eastAsia="Arial" w:hAnsi="Arial"/>
-          <w:sz w:val="18"/>
-          <w:highlight w:val="lightGray"/>
-        </w:rPr>
-        <w:t>6</w:t>
-      </w:r>
-      <w:r>
-        <w:rPr>
-          <w:rFonts w:ascii="Arial" w:eastAsia="Arial" w:hAnsi="Arial"/>
-          <w:sz w:val="18"/>
-          <w:highlight w:val="lightGray"/>
-        </w:rPr>
-        <w:t>]</w:t>
+        <w:t>[4/21/2026]</w:t>
       </w:r>
     </w:p>
     <w:p>

</xml_diff>